<commit_message>
finished my artist statement for project 2
</commit_message>
<xml_diff>
--- a/Projects/project2/interactive_bike_garage_ii/assets/Interactive Bike Garage 2 - Artist Statement - Emile Bedard.docx
+++ b/Projects/project2/interactive_bike_garage_ii/assets/Interactive Bike Garage 2 - Artist Statement - Emile Bedard.docx
@@ -244,6 +244,7 @@
       <w:r>
         <w:rPr>
           <w:rFonts w:ascii="Times New Roman" w:eastAsia="Times New Roman" w:hAnsi="Times New Roman" w:cs="Times New Roman"/>
+          <w:noProof/>
           <w:sz w:val="24"/>
           <w:szCs w:val="24"/>
           <w:lang w:val="en-CA"/>
@@ -647,25 +648,83 @@
           <w:szCs w:val="24"/>
           <w:lang w:val="en-CA"/>
         </w:rPr>
-        <w:t xml:space="preserve">My next challenge was to keep as much as possible from my previous hmtl/css layout and maximize my time and energy on the 3D with Three.js. It was not </w:t>
-      </w:r>
-      <w:r>
-        <w:rPr>
-          <w:rFonts w:ascii="Times New Roman" w:eastAsia="Times New Roman" w:hAnsi="Times New Roman" w:cs="Times New Roman"/>
-          <w:sz w:val="24"/>
-          <w:szCs w:val="24"/>
-          <w:lang w:val="en-CA"/>
-        </w:rPr>
-        <w:t>was</w:t>
-      </w:r>
-      <w:r>
-        <w:rPr>
-          <w:rFonts w:ascii="Times New Roman" w:eastAsia="Times New Roman" w:hAnsi="Times New Roman" w:cs="Times New Roman"/>
-          <w:sz w:val="24"/>
-          <w:szCs w:val="24"/>
-          <w:lang w:val="en-CA"/>
-        </w:rPr>
-        <w:t xml:space="preserve"> and I feal still not completely sure about the styling but integrating the 3D canvas seamlessly was not easy. For the next version, I will start from scratch and build on top of the canvas to really make a new styling and UI interface that feels much more integrated and cohesive.</w:t>
+        <w:t xml:space="preserve">My next challenge was to keep as much as possible from my previous </w:t>
+      </w:r>
+      <w:proofErr w:type="spellStart"/>
+      <w:r>
+        <w:rPr>
+          <w:rFonts w:ascii="Times New Roman" w:eastAsia="Times New Roman" w:hAnsi="Times New Roman" w:cs="Times New Roman"/>
+          <w:sz w:val="24"/>
+          <w:szCs w:val="24"/>
+          <w:lang w:val="en-CA"/>
+        </w:rPr>
+        <w:t>hmtl</w:t>
+      </w:r>
+      <w:proofErr w:type="spellEnd"/>
+      <w:r>
+        <w:rPr>
+          <w:rFonts w:ascii="Times New Roman" w:eastAsia="Times New Roman" w:hAnsi="Times New Roman" w:cs="Times New Roman"/>
+          <w:sz w:val="24"/>
+          <w:szCs w:val="24"/>
+          <w:lang w:val="en-CA"/>
+        </w:rPr>
+        <w:t>/</w:t>
+      </w:r>
+      <w:proofErr w:type="spellStart"/>
+      <w:r>
+        <w:rPr>
+          <w:rFonts w:ascii="Times New Roman" w:eastAsia="Times New Roman" w:hAnsi="Times New Roman" w:cs="Times New Roman"/>
+          <w:sz w:val="24"/>
+          <w:szCs w:val="24"/>
+          <w:lang w:val="en-CA"/>
+        </w:rPr>
+        <w:t>css</w:t>
+      </w:r>
+      <w:proofErr w:type="spellEnd"/>
+      <w:r>
+        <w:rPr>
+          <w:rFonts w:ascii="Times New Roman" w:eastAsia="Times New Roman" w:hAnsi="Times New Roman" w:cs="Times New Roman"/>
+          <w:sz w:val="24"/>
+          <w:szCs w:val="24"/>
+          <w:lang w:val="en-CA"/>
+        </w:rPr>
+        <w:t xml:space="preserve"> layout and maximize my time and energy on the 3D with Three.js.</w:t>
+      </w:r>
+      <w:r>
+        <w:rPr>
+          <w:rFonts w:ascii="Times New Roman" w:eastAsia="Times New Roman" w:hAnsi="Times New Roman" w:cs="Times New Roman"/>
+          <w:sz w:val="24"/>
+          <w:szCs w:val="24"/>
+          <w:lang w:val="en-CA"/>
+        </w:rPr>
+        <w:t xml:space="preserve"> </w:t>
+      </w:r>
+      <w:r>
+        <w:rPr>
+          <w:rFonts w:ascii="Times New Roman" w:eastAsia="Times New Roman" w:hAnsi="Times New Roman" w:cs="Times New Roman"/>
+          <w:sz w:val="24"/>
+          <w:szCs w:val="24"/>
+          <w:lang w:val="en-CA"/>
+        </w:rPr>
+        <w:t xml:space="preserve">I </w:t>
+      </w:r>
+      <w:r>
+        <w:rPr>
+          <w:rFonts w:ascii="Times New Roman" w:eastAsia="Times New Roman" w:hAnsi="Times New Roman" w:cs="Times New Roman"/>
+          <w:sz w:val="24"/>
+          <w:szCs w:val="24"/>
+          <w:lang w:val="en-CA"/>
+        </w:rPr>
+        <w:t xml:space="preserve">still </w:t>
+      </w:r>
+      <w:r>
+        <w:rPr>
+          <w:rFonts w:ascii="Times New Roman" w:eastAsia="Times New Roman" w:hAnsi="Times New Roman" w:cs="Times New Roman"/>
+          <w:sz w:val="24"/>
+          <w:szCs w:val="24"/>
+          <w:lang w:val="en-CA"/>
+        </w:rPr>
+        <w:t>feal not completely sure about the styling but integrating the 3D canvas seamlessly was not easy. For the next version, I will start from scratch and build on top of the canvas to really make a new styling and UI interface that feels much more integrated and cohesive.</w:t>
       </w:r>
     </w:p>
     <w:p>
@@ -696,7 +755,7 @@
           <w:lang w:val="en-CA"/>
         </w:rPr>
         <w:drawing>
-          <wp:anchor distT="0" distB="0" distL="114300" distR="114300" simplePos="0" relativeHeight="251660288" behindDoc="1" locked="0" layoutInCell="1" allowOverlap="1" wp14:anchorId="7BAE7B20" wp14:editId="5EF355AA">
+          <wp:anchor distT="0" distB="0" distL="114300" distR="114300" simplePos="0" relativeHeight="251660288" behindDoc="1" locked="0" layoutInCell="1" allowOverlap="1" wp14:anchorId="7BAE7B20" wp14:editId="1CA848BD">
             <wp:simplePos x="0" y="0"/>
             <wp:positionH relativeFrom="margin">
               <wp:align>center</wp:align>
@@ -893,12 +952,9 @@
           <w:szCs w:val="20"/>
           <w:lang w:val="en-CA"/>
         </w:rPr>
-        <w:t>Importing and integrating GLTF in THREE.JS</w:t>
-      </w:r>
-    </w:p>
-    <w:p>
-      <w:pPr>
-        <w:jc w:val="both"/>
+        <w:t>Importing and integrating GLTF</w:t>
+      </w:r>
+      <w:r>
         <w:rPr>
           <w:rFonts w:ascii="Times New Roman" w:eastAsia="Times New Roman" w:hAnsi="Times New Roman" w:cs="Times New Roman"/>
           <w:i/>
@@ -907,25 +963,97 @@
           <w:szCs w:val="20"/>
           <w:lang w:val="en-CA"/>
         </w:rPr>
-      </w:pPr>
-    </w:p>
-    <w:p>
-      <w:pPr>
-        <w:rPr>
-          <w:rFonts w:ascii="Times New Roman" w:eastAsia="Times New Roman" w:hAnsi="Times New Roman" w:cs="Times New Roman"/>
-          <w:sz w:val="24"/>
-          <w:szCs w:val="24"/>
-          <w:lang w:val="en-CA"/>
-        </w:rPr>
-      </w:pPr>
-      <w:r>
-        <w:rPr>
-          <w:rFonts w:ascii="Times New Roman" w:eastAsia="Times New Roman" w:hAnsi="Times New Roman" w:cs="Times New Roman"/>
-          <w:sz w:val="24"/>
-          <w:szCs w:val="24"/>
-          <w:lang w:val="en-CA"/>
-        </w:rPr>
-        <w:t>Importing gltf and retrieving data, animation, scenes, lights and cameras was very tricky.</w:t>
+        <w:t>s</w:t>
+      </w:r>
+      <w:r>
+        <w:rPr>
+          <w:rFonts w:ascii="Times New Roman" w:eastAsia="Times New Roman" w:hAnsi="Times New Roman" w:cs="Times New Roman"/>
+          <w:i/>
+          <w:iCs/>
+          <w:sz w:val="20"/>
+          <w:szCs w:val="20"/>
+          <w:lang w:val="en-CA"/>
+        </w:rPr>
+        <w:t xml:space="preserve"> in THREE.JS</w:t>
+      </w:r>
+    </w:p>
+    <w:p>
+      <w:pPr>
+        <w:jc w:val="both"/>
+        <w:rPr>
+          <w:rFonts w:ascii="Times New Roman" w:eastAsia="Times New Roman" w:hAnsi="Times New Roman" w:cs="Times New Roman"/>
+          <w:i/>
+          <w:iCs/>
+          <w:sz w:val="20"/>
+          <w:szCs w:val="20"/>
+          <w:lang w:val="en-CA"/>
+        </w:rPr>
+      </w:pPr>
+    </w:p>
+    <w:p>
+      <w:pPr>
+        <w:rPr>
+          <w:rFonts w:ascii="Times New Roman" w:eastAsia="Times New Roman" w:hAnsi="Times New Roman" w:cs="Times New Roman"/>
+          <w:sz w:val="24"/>
+          <w:szCs w:val="24"/>
+          <w:lang w:val="en-CA"/>
+        </w:rPr>
+      </w:pPr>
+      <w:r>
+        <w:rPr>
+          <w:rFonts w:ascii="Times New Roman" w:eastAsia="Times New Roman" w:hAnsi="Times New Roman" w:cs="Times New Roman"/>
+          <w:sz w:val="24"/>
+          <w:szCs w:val="24"/>
+          <w:lang w:val="en-CA"/>
+        </w:rPr>
+        <w:t xml:space="preserve">Importing </w:t>
+      </w:r>
+      <w:r>
+        <w:rPr>
+          <w:rFonts w:ascii="Times New Roman" w:eastAsia="Times New Roman" w:hAnsi="Times New Roman" w:cs="Times New Roman"/>
+          <w:sz w:val="24"/>
+          <w:szCs w:val="24"/>
+          <w:lang w:val="en-CA"/>
+        </w:rPr>
+        <w:t xml:space="preserve">the GLTF format </w:t>
+      </w:r>
+      <w:r>
+        <w:rPr>
+          <w:rFonts w:ascii="Times New Roman" w:eastAsia="Times New Roman" w:hAnsi="Times New Roman" w:cs="Times New Roman"/>
+          <w:sz w:val="24"/>
+          <w:szCs w:val="24"/>
+          <w:lang w:val="en-CA"/>
+        </w:rPr>
+        <w:t>and retrieving data, animation, scenes, lights and cameras was very tricky.</w:t>
+      </w:r>
+      <w:r>
+        <w:rPr>
+          <w:rFonts w:ascii="Times New Roman" w:eastAsia="Times New Roman" w:hAnsi="Times New Roman" w:cs="Times New Roman"/>
+          <w:sz w:val="24"/>
+          <w:szCs w:val="24"/>
+          <w:lang w:val="en-CA"/>
+        </w:rPr>
+        <w:t xml:space="preserve"> It was imperative to keep a good file system and to really organize my objects name to be able to point them out easily afterwards. The camera logic was especially delicate because I needed to redirect it from the </w:t>
+      </w:r>
+      <w:proofErr w:type="spellStart"/>
+      <w:r>
+        <w:rPr>
+          <w:rFonts w:ascii="Times New Roman" w:eastAsia="Times New Roman" w:hAnsi="Times New Roman" w:cs="Times New Roman"/>
+          <w:sz w:val="24"/>
+          <w:szCs w:val="24"/>
+          <w:lang w:val="en-CA"/>
+        </w:rPr>
+        <w:t>Three.Js</w:t>
+      </w:r>
+      <w:proofErr w:type="spellEnd"/>
+      <w:r>
+        <w:rPr>
+          <w:rFonts w:ascii="Times New Roman" w:eastAsia="Times New Roman" w:hAnsi="Times New Roman" w:cs="Times New Roman"/>
+          <w:sz w:val="24"/>
+          <w:szCs w:val="24"/>
+          <w:lang w:val="en-CA"/>
+        </w:rPr>
+        <w:t xml:space="preserve"> interface to store it in a variable, rename it and then attach to my renderer nut only once it was loaded from my try/catch asynchronous function.</w:t>
       </w:r>
     </w:p>
     <w:p>
@@ -1163,7 +1291,7 @@
           <w:szCs w:val="20"/>
           <w:lang w:val="en-CA"/>
         </w:rPr>
-        <w:t>Layout and HTML hierarchy</w:t>
+        <w:t>Lightmap baking and UV unpacking</w:t>
       </w:r>
     </w:p>
     <w:p>
@@ -1195,7 +1323,70 @@
           <w:szCs w:val="24"/>
           <w:lang w:val="en-CA"/>
         </w:rPr>
-        <w:t>My next challenge was to keep as much as possible from my previous hmtl/css layout and maximize my time and energy on the 3D with Three.js. It was not wasy and I feal still not completely sure about the styling but integrating the 3D canvas seamlessly was not easy. For the next version, I will start from scratch and build on top of the canvas to really make a new styling and UI interface that feels much more integrated and cohesive.</w:t>
+        <w:t xml:space="preserve">Lightmap baking and UV unpacking were familiar concept for </w:t>
+      </w:r>
+      <w:r>
+        <w:rPr>
+          <w:rFonts w:ascii="Times New Roman" w:eastAsia="Times New Roman" w:hAnsi="Times New Roman" w:cs="Times New Roman"/>
+          <w:sz w:val="24"/>
+          <w:szCs w:val="24"/>
+          <w:lang w:val="en-CA"/>
+        </w:rPr>
+        <w:t>me</w:t>
+      </w:r>
+      <w:r>
+        <w:rPr>
+          <w:rFonts w:ascii="Times New Roman" w:eastAsia="Times New Roman" w:hAnsi="Times New Roman" w:cs="Times New Roman"/>
+          <w:sz w:val="24"/>
+          <w:szCs w:val="24"/>
+          <w:lang w:val="en-CA"/>
+        </w:rPr>
+        <w:t xml:space="preserve"> with the previous experience that I had with </w:t>
+      </w:r>
+      <w:r>
+        <w:rPr>
+          <w:rFonts w:ascii="Times New Roman" w:eastAsia="Times New Roman" w:hAnsi="Times New Roman" w:cs="Times New Roman"/>
+          <w:sz w:val="24"/>
+          <w:szCs w:val="24"/>
+          <w:lang w:val="en-CA"/>
+        </w:rPr>
+        <w:t>Blender,</w:t>
+      </w:r>
+      <w:r>
+        <w:rPr>
+          <w:rFonts w:ascii="Times New Roman" w:eastAsia="Times New Roman" w:hAnsi="Times New Roman" w:cs="Times New Roman"/>
+          <w:sz w:val="24"/>
+          <w:szCs w:val="24"/>
+          <w:lang w:val="en-CA"/>
+        </w:rPr>
+        <w:t xml:space="preserve"> but I never </w:t>
+      </w:r>
+      <w:r>
+        <w:rPr>
+          <w:rFonts w:ascii="Times New Roman" w:eastAsia="Times New Roman" w:hAnsi="Times New Roman" w:cs="Times New Roman"/>
+          <w:sz w:val="24"/>
+          <w:szCs w:val="24"/>
+          <w:lang w:val="en-CA"/>
+        </w:rPr>
+        <w:t>fully</w:t>
+      </w:r>
+      <w:r>
+        <w:rPr>
+          <w:rFonts w:ascii="Times New Roman" w:eastAsia="Times New Roman" w:hAnsi="Times New Roman" w:cs="Times New Roman"/>
+          <w:sz w:val="24"/>
+          <w:szCs w:val="24"/>
+          <w:lang w:val="en-CA"/>
+        </w:rPr>
+        <w:t xml:space="preserve"> implemented them in a project before this one. It was tricky to figure out the technical manipulations and procedures but once these constraints were out the way, I really had a lot of fun to play with the light and achieve a much more realistic look</w:t>
+      </w:r>
+      <w:r>
+        <w:rPr>
+          <w:rFonts w:ascii="Times New Roman" w:eastAsia="Times New Roman" w:hAnsi="Times New Roman" w:cs="Times New Roman"/>
+          <w:sz w:val="24"/>
+          <w:szCs w:val="24"/>
+          <w:lang w:val="en-CA"/>
+        </w:rPr>
+        <w:t xml:space="preserve"> for my scene.</w:t>
       </w:r>
     </w:p>
     <w:p>
@@ -1423,7 +1614,7 @@
           <w:szCs w:val="20"/>
           <w:lang w:val="en-CA"/>
         </w:rPr>
-        <w:t>Layout and HTML hierarchy</w:t>
+        <w:t>Normals and face orientation</w:t>
       </w:r>
     </w:p>
     <w:p>
@@ -1455,7 +1646,7 @@
           <w:szCs w:val="24"/>
           <w:lang w:val="en-CA"/>
         </w:rPr>
-        <w:t>My next challenge was to keep as much as possible from my previous hmtl/css layout and maximize my time and energy on the 3D with Three.js. It was not wasy and I feal still not completely sure about the styling but integrating the 3D canvas seamlessly was not easy. For the next version, I will start from scratch and build on top of the canvas to really make a new styling and UI interface that feels much more integrated and cohesive.</w:t>
+        <w:t>Finally, normals and 3D face orientations were also a significant speed bump in my Blender 3D Pipeline. As I explain in the video, importing external 3D models and assets can always be tricky and this bicycle 3D model was no exception. I had to rework all the faces orientation manually to achieve realistic light reflections with the rendering and global illumination.</w:t>
       </w:r>
     </w:p>
     <w:sectPr>
@@ -1540,6 +1731,15 @@
         <w:lang w:val="en-CA"/>
       </w:rPr>
       <w:t>Artist Statement, Interactive Bike Garage</w:t>
+    </w:r>
+    <w:r>
+      <w:rPr>
+        <w:rFonts w:ascii="Times New Roman" w:eastAsia="Times New Roman" w:hAnsi="Times New Roman" w:cs="Times New Roman"/>
+        <w:sz w:val="24"/>
+        <w:szCs w:val="24"/>
+        <w:lang w:val="en-CA"/>
+      </w:rPr>
+      <w:t xml:space="preserve"> II</w:t>
     </w:r>
   </w:p>
   <w:p>
@@ -1601,7 +1801,25 @@
         <w:szCs w:val="24"/>
         <w:lang w:val="en-CA"/>
       </w:rPr>
-      <w:t>CART 263,Creative Computation II, Section A</w:t>
+      <w:t xml:space="preserve">CART </w:t>
+    </w:r>
+    <w:r>
+      <w:rPr>
+        <w:rFonts w:ascii="Times New Roman" w:eastAsia="Times New Roman" w:hAnsi="Times New Roman" w:cs="Times New Roman"/>
+        <w:sz w:val="24"/>
+        <w:szCs w:val="24"/>
+        <w:lang w:val="en-CA"/>
+      </w:rPr>
+      <w:t>263, Creative</w:t>
+    </w:r>
+    <w:r>
+      <w:rPr>
+        <w:rFonts w:ascii="Times New Roman" w:eastAsia="Times New Roman" w:hAnsi="Times New Roman" w:cs="Times New Roman"/>
+        <w:sz w:val="24"/>
+        <w:szCs w:val="24"/>
+        <w:lang w:val="en-CA"/>
+      </w:rPr>
+      <w:t xml:space="preserve"> Computation II, Section A</w:t>
     </w:r>
   </w:p>
   <w:p>
@@ -1672,7 +1890,7 @@
     </w:r>
     <w:r>
       <w:pict w14:anchorId="4490D7F1">
-        <v:rect id="_x0000_i1034" style="width:0;height:1.5pt" o:hralign="center" o:hrstd="t" o:hr="t" fillcolor="#a0a0a0" stroked="f"/>
+        <v:rect id="_x0000_i1026" style="width:0;height:1.5pt" o:hralign="center" o:hrstd="t" o:hr="t" fillcolor="#a0a0a0" stroked="f"/>
       </w:pict>
     </w:r>
   </w:p>
@@ -2195,7 +2413,6 @@
   <w:style w:type="character" w:default="1" w:styleId="Policepardfaut">
     <w:name w:val="Default Paragraph Font"/>
     <w:uiPriority w:val="1"/>
-    <w:semiHidden/>
     <w:unhideWhenUsed/>
   </w:style>
   <w:style w:type="table" w:default="1" w:styleId="TableauNormal">

</xml_diff>